<commit_message>
Complete page-level publication render audit
</commit_message>
<xml_diff>
--- a/manuscript/publication_package/output/trackleed_manuscript.docx
+++ b/manuscript/publication_package/output/trackleed_manuscript.docx
@@ -10118,6 +10118,11 @@
       </w:r>
     </w:p>
     <w:p>
+      <w:r>
+        <w:br w:type="page"/>
+      </w:r>
+    </w:p>
+    <w:p>
       <w:pPr>
         <w:pStyle w:val="BodyText"/>
       </w:pPr>
@@ -10373,11 +10378,6 @@
       </w:r>
       <w:r>
         <w:t xml:space="preserve">separate denominators and do not form a composite ranking.</w:t>
-      </w:r>
-    </w:p>
-    <w:p>
-      <w:r>
-        <w:br w:type="page"/>
       </w:r>
     </w:p>
     <w:p>
@@ -10558,6 +10558,11 @@
       </w:r>
     </w:p>
     <w:p>
+      <w:r>
+        <w:br w:type="page"/>
+      </w:r>
+    </w:p>
+    <w:p>
       <w:pPr>
         <w:pStyle w:val="BodyText"/>
       </w:pPr>
@@ -10970,6 +10975,11 @@
       </w:r>
     </w:p>
     <w:p>
+      <w:r>
+        <w:br w:type="page"/>
+      </w:r>
+    </w:p>
+    <w:p>
       <w:pPr>
         <w:pStyle w:val="BodyText"/>
       </w:pPr>
@@ -11273,6 +11283,11 @@
             </a:graphic>
           </wp:inline>
         </w:drawing>
+      </w:r>
+    </w:p>
+    <w:p>
+      <w:r>
+        <w:br w:type="page"/>
       </w:r>
     </w:p>
     <w:p>

</xml_diff>